<commit_message>
refactor(orm): typovane modely SQLAlchemy 2.0, UTC casova razitka, psycopg2 driver, nova signatura TemplateResponse; aktualizace README a docx
</commit_message>
<xml_diff>
--- a/PPRO_Dokumentace.docx
+++ b/PPRO_Dokumentace.docx
@@ -1,71 +1,5 @@
 
-<file path=customXml\item1.xml><?xml version="1.0" encoding="utf-8"?>
-<b:Sources xmlns:b="http://schemas.openxmlformats.org/officeDocument/2006/bibliography" xmlns="http://schemas.openxmlformats.org/officeDocument/2006/bibliography" SelectedStyle="/APA.XSL" StyleName="APA"/>
-</file>
-
-<file path=customXml\itemProps1.xml><?xml version="1.0" encoding="utf-8"?>
-<ds:datastoreItem xmlns:ds="http://schemas.openxmlformats.org/officeDocument/2006/customXml" ds:itemID="{EF278816-EC6F-A645-907D-7F25AECB1D4A}">
-  <ds:schemaRefs>
-    <ds:schemaRef ds:uri="http://schemas.openxmlformats.org/officeDocument/2006/bibliography"/>
-  </ds:schemaRefs>
-</ds:datastoreItem>
-</file>
-
-<file path=docProps\app.xml><?xml version="1.0" encoding="utf-8"?>
-<Properties xmlns="http://schemas.openxmlformats.org/officeDocument/2006/extended-properties" xmlns:vt="http://schemas.openxmlformats.org/officeDocument/2006/docPropsVTypes">
-  <Template>Normal.dotm</Template>
-  <TotalTime>0</TotalTime>
-  <Pages>1</Pages>
-  <Words>0</Words>
-  <Characters>0</Characters>
-  <Application>Microsoft Macintosh Word</Application>
-  <DocSecurity>0</DocSecurity>
-  <Lines>0</Lines>
-  <Paragraphs>0</Paragraphs>
-  <ScaleCrop>false</ScaleCrop>
-  <HeadingPairs>
-    <vt:vector size="2" baseType="variant">
-      <vt:variant>
-        <vt:lpstr>Title</vt:lpstr>
-      </vt:variant>
-      <vt:variant>
-        <vt:i4>1</vt:i4>
-      </vt:variant>
-    </vt:vector>
-  </HeadingPairs>
-  <TitlesOfParts>
-    <vt:vector size="1" baseType="lpstr">
-      <vt:lpstr/>
-    </vt:vector>
-  </TitlesOfParts>
-  <Manager/>
-  <Company/>
-  <LinksUpToDate>false</LinksUpToDate>
-  <CharactersWithSpaces>0</CharactersWithSpaces>
-  <SharedDoc>false</SharedDoc>
-  <HyperlinkBase/>
-  <HyperlinksChanged>false</HyperlinksChanged>
-  <AppVersion>14.0000</AppVersion>
-</Properties>
-</file>
-
-<file path=docProps\core.xml><?xml version="1.0" encoding="utf-8"?>
-<cp:coreProperties xmlns:cp="http://schemas.openxmlformats.org/package/2006/metadata/core-properties" xmlns:dc="http://purl.org/dc/elements/1.1/" xmlns:dcterms="http://purl.org/dc/terms/" xmlns:dcmitype="http://purl.org/dc/dcmitype/" xmlns:xsi="http://www.w3.org/2001/XMLSchema-instance">
-  <dc:title>Dokumentace semestrálního projektu PPRO</dc:title>
-  <dc:subject/>
-  <dc:creator/>
-  <cp:keywords/>
-  <dc:description>generated by python-docx</dc:description>
-  <cp:lastModifiedBy/>
-  <cp:revision>1</cp:revision>
-  <dcterms:created xsi:type="dcterms:W3CDTF">2013-12-23T23:15:00Z</dcterms:created>
-  <dcterms:modified xsi:type="dcterms:W3CDTF">2013-12-23T23:15:00Z</dcterms:modified>
-  <cp:category/>
-  <dc:language>cs-CZ</dc:language>
-</cp:coreProperties>
-</file>
-
-<file path=word\document.xml><?xml version="1.0" encoding="utf-8"?>
+<file path=word/document.xml><?xml version="1.0" encoding="utf-8"?>
 <w:document xmlns:wpc="http://schemas.microsoft.com/office/word/2010/wordprocessingCanvas" xmlns:mo="http://schemas.microsoft.com/office/mac/office/2008/main" xmlns:mc="http://schemas.openxmlformats.org/markup-compatibility/2006" xmlns:mv="urn:schemas-microsoft-com:mac:vml" xmlns:o="urn:schemas-microsoft-com:office:office" xmlns:r="http://schemas.openxmlformats.org/officeDocument/2006/relationships" xmlns:m="http://schemas.openxmlformats.org/officeDocument/2006/math" xmlns:v="urn:schemas-microsoft-com:vml" xmlns:wp14="http://schemas.microsoft.com/office/word/2010/wordprocessingDrawing" xmlns:wp="http://schemas.openxmlformats.org/drawingml/2006/wordprocessingDrawing" xmlns:w10="urn:schemas-microsoft-com:office:word" xmlns:w="http://schemas.openxmlformats.org/wordprocessingml/2006/main" xmlns:w14="http://schemas.microsoft.com/office/word/2010/wordml" xmlns:wpg="http://schemas.microsoft.com/office/word/2010/wordprocessingGroup" xmlns:wpi="http://schemas.microsoft.com/office/word/2010/wordprocessingInk" xmlns:wne="http://schemas.microsoft.com/office/word/2006/wordml" xmlns:wps="http://schemas.microsoft.com/office/word/2010/wordprocessingShape" mc:Ignorable="w14 wp14">
   <w:body>
     <w:p>
@@ -344,7 +278,7 @@
               <w:rPr>
                 <w:sz val="20"/>
               </w:rPr>
-              <w:t>7. 10. 2026</w:t>
+              <w:t>21. 10. 2026</w:t>
             </w:r>
           </w:p>
         </w:tc>
@@ -1476,6 +1410,99 @@
           </w:p>
         </w:tc>
       </w:tr>
+      <w:tr>
+        <w:trPr>
+          <w:trHeight w:val="510"/>
+        </w:trPr>
+        <w:tc>
+          <w:tcPr>
+            <w:tcW w:type="dxa" w:w="737"/>
+            <w:tcMar>
+              <w:top w:w="70" w:type="dxa"/>
+              <w:left w:w="100" w:type="dxa"/>
+              <w:bottom w:w="70" w:type="dxa"/>
+              <w:right w:w="100" w:type="dxa"/>
+            </w:tcMar>
+          </w:tcPr>
+          <w:p>
+            <w:pPr>
+              <w:spacing after="0"/>
+            </w:pPr>
+            <w:r>
+              <w:rPr>
+                <w:sz val="20"/>
+              </w:rPr>
+              <w:t>R11</w:t>
+            </w:r>
+          </w:p>
+        </w:tc>
+        <w:tc>
+          <w:tcPr>
+            <w:tcW w:type="dxa" w:w="3628"/>
+            <w:tcMar>
+              <w:top w:w="70" w:type="dxa"/>
+              <w:left w:w="100" w:type="dxa"/>
+              <w:bottom w:w="70" w:type="dxa"/>
+              <w:right w:w="100" w:type="dxa"/>
+            </w:tcMar>
+          </w:tcPr>
+          <w:p>
+            <w:pPr>
+              <w:spacing after="0"/>
+            </w:pPr>
+            <w:r>
+              <w:rPr>
+                <w:sz val="20"/>
+              </w:rPr>
+              <w:t>ORM modely v typovaném stylu SQLAlchemy 2.0 (Mapped / mapped_column), explicitní ovladač postgresql+psycopg2 a časová razítka v UTC s časovou zónou (datetime.now(timezone.utc)).</w:t>
+            </w:r>
+          </w:p>
+        </w:tc>
+        <w:tc>
+          <w:tcPr>
+            <w:tcW w:type="dxa" w:w="3855"/>
+            <w:tcMar>
+              <w:top w:w="70" w:type="dxa"/>
+              <w:left w:w="100" w:type="dxa"/>
+              <w:bottom w:w="70" w:type="dxa"/>
+              <w:right w:w="100" w:type="dxa"/>
+            </w:tcMar>
+          </w:tcPr>
+          <w:p>
+            <w:pPr>
+              <w:spacing after="0"/>
+            </w:pPr>
+            <w:r>
+              <w:rPr>
+                <w:sz val="20"/>
+              </w:rPr>
+              <w:t>Statická kontrola typů v IDE odhalí chyby dříve; SQLAlchemy 2.1+ jinak volí psycopg v3, který není v závislostech; datetime.utcnow() je v Pythonu 3.12+ zastaralé.</w:t>
+            </w:r>
+          </w:p>
+        </w:tc>
+        <w:tc>
+          <w:tcPr>
+            <w:tcW w:type="dxa" w:w="1417"/>
+            <w:tcMar>
+              <w:top w:w="70" w:type="dxa"/>
+              <w:left w:w="100" w:type="dxa"/>
+              <w:bottom w:w="70" w:type="dxa"/>
+              <w:right w:w="100" w:type="dxa"/>
+            </w:tcMar>
+          </w:tcPr>
+          <w:p>
+            <w:pPr>
+              <w:spacing after="0"/>
+            </w:pPr>
+            <w:r>
+              <w:rPr>
+                <w:sz val="20"/>
+              </w:rPr>
+              <w:t>21. 10. 2026</w:t>
+            </w:r>
+          </w:p>
+        </w:tc>
+      </w:tr>
     </w:tbl>
     <w:p>
       <w:pPr>
@@ -2223,70 +2250,7 @@
 </w:document>
 </file>
 
-<file path=word\fontTable.xml><?xml version="1.0" encoding="utf-8"?>
-<w:fonts xmlns:mc="http://schemas.openxmlformats.org/markup-compatibility/2006" xmlns:r="http://schemas.openxmlformats.org/officeDocument/2006/relationships" xmlns:w="http://schemas.openxmlformats.org/wordprocessingml/2006/main" xmlns:w14="http://schemas.microsoft.com/office/word/2010/wordml" mc:Ignorable="w14">
-  <w:font w:name="Symbol">
-    <w:panose1 w:val="00000000000000000000"/>
-    <w:charset w:val="02"/>
-    <w:family w:val="auto"/>
-    <w:pitch w:val="variable"/>
-    <w:sig w:usb0="00000000" w:usb1="10000000" w:usb2="00000000" w:usb3="00000000" w:csb0="80000000" w:csb1="00000000"/>
-  </w:font>
-  <w:font w:name="Times New Roman">
-    <w:panose1 w:val="02020603050405020304"/>
-    <w:charset w:val="00"/>
-    <w:family w:val="auto"/>
-    <w:pitch w:val="variable"/>
-    <w:sig w:usb0="E0002AFF" w:usb1="C0007841" w:usb2="00000009" w:usb3="00000000" w:csb0="000001FF" w:csb1="00000000"/>
-  </w:font>
-  <w:font w:name="Cambria">
-    <w:panose1 w:val="02040503050406030204"/>
-    <w:charset w:val="00"/>
-    <w:family w:val="auto"/>
-    <w:pitch w:val="variable"/>
-    <w:sig w:usb0="E00002FF" w:usb1="400004FF" w:usb2="00000000" w:usb3="00000000" w:csb0="0000019F" w:csb1="00000000"/>
-  </w:font>
-  <w:font w:name="ＭＳ 明朝">
-    <w:panose1 w:val="00000000000000000000"/>
-    <w:charset w:val="80"/>
-    <w:family w:val="roman"/>
-    <w:notTrueType/>
-    <w:pitch w:val="fixed"/>
-    <w:sig w:usb0="00000001" w:usb1="08070000" w:usb2="00000010" w:usb3="00000000" w:csb0="00020000" w:csb1="00000000"/>
-  </w:font>
-  <w:font w:name="Calibri">
-    <w:panose1 w:val="020F0502020204030204"/>
-    <w:charset w:val="00"/>
-    <w:family w:val="auto"/>
-    <w:pitch w:val="variable"/>
-    <w:sig w:usb0="E10002FF" w:usb1="4000ACFF" w:usb2="00000009" w:usb3="00000000" w:csb0="0000019F" w:csb1="00000000"/>
-  </w:font>
-  <w:font w:name="ＭＳ ゴシック">
-    <w:panose1 w:val="00000000000000000000"/>
-    <w:charset w:val="80"/>
-    <w:family w:val="modern"/>
-    <w:notTrueType/>
-    <w:pitch w:val="fixed"/>
-    <w:sig w:usb0="00000001" w:usb1="08070000" w:usb2="00000010" w:usb3="00000000" w:csb0="00020000" w:csb1="00000000"/>
-  </w:font>
-  <w:font w:name="Courier">
-    <w:panose1 w:val="02000500000000000000"/>
-    <w:charset w:val="00"/>
-    <w:family w:val="auto"/>
-    <w:pitch w:val="variable"/>
-    <w:sig w:usb0="00000003" w:usb1="00000000" w:usb2="00000000" w:usb3="00000000" w:csb0="00000001" w:csb1="00000000"/>
-  </w:font>
-  <w:font w:name="Arial">
-    <w:panose1 w:val="020B0604020202020204"/>
-    <w:charset w:val="00"/>
-    <w:family w:val="auto"/>
-    <w:pitch w:val="variable"/>
-    <w:sig w:usb0="E0002AFF" w:usb1="C0007843" w:usb2="00000009" w:usb3="00000000" w:csb0="000001FF" w:csb1="00000000"/>
-  </w:font>
-</w:fonts>
-</file>
-
-<file path=word\numbering.xml><?xml version="1.0" encoding="utf-8"?>
+<file path=word/numbering.xml><?xml version="1.0" encoding="utf-8"?>
 <w:numbering xmlns:wpc="http://schemas.microsoft.com/office/word/2010/wordprocessingCanvas" xmlns:mo="http://schemas.microsoft.com/office/mac/office/2008/main" xmlns:mc="http://schemas.openxmlformats.org/markup-compatibility/2006" xmlns:mv="urn:schemas-microsoft-com:mac:vml" xmlns:o="urn:schemas-microsoft-com:office:office" xmlns:r="http://schemas.openxmlformats.org/officeDocument/2006/relationships" xmlns:m="http://schemas.openxmlformats.org/officeDocument/2006/math" xmlns:v="urn:schemas-microsoft-com:vml" xmlns:wp14="http://schemas.microsoft.com/office/word/2010/wordprocessingDrawing" xmlns:wp="http://schemas.openxmlformats.org/drawingml/2006/wordprocessingDrawing" xmlns:w10="urn:schemas-microsoft-com:office:word" xmlns:w="http://schemas.openxmlformats.org/wordprocessingml/2006/main" xmlns:w14="http://schemas.microsoft.com/office/word/2010/wordml" xmlns:wpg="http://schemas.microsoft.com/office/word/2010/wordprocessingGroup" xmlns:wpi="http://schemas.microsoft.com/office/word/2010/wordprocessingInk" xmlns:wne="http://schemas.microsoft.com/office/word/2006/wordml" xmlns:wps="http://schemas.microsoft.com/office/word/2010/wordprocessingShape" mc:Ignorable="w14 wp14">
   <w:abstractNum w:abstractNumId="0">
     <w:nsid w:val="FFFFFF7C"/>
@@ -2489,62 +2453,7 @@
 </w:numbering>
 </file>
 
-<file path=word\settings.xml><?xml version="1.0" encoding="utf-8"?>
-<w:settings xmlns:mc="http://schemas.openxmlformats.org/markup-compatibility/2006" xmlns:o="urn:schemas-microsoft-com:office:office" xmlns:r="http://schemas.openxmlformats.org/officeDocument/2006/relationships" xmlns:m="http://schemas.openxmlformats.org/officeDocument/2006/math" xmlns:v="urn:schemas-microsoft-com:vml" xmlns:w10="urn:schemas-microsoft-com:office:word" xmlns:w="http://schemas.openxmlformats.org/wordprocessingml/2006/main" xmlns:w14="http://schemas.microsoft.com/office/word/2010/wordml" xmlns:sl="http://schemas.openxmlformats.org/schemaLibrary/2006/main" mc:Ignorable="w14">
-  <w:zoom w:val="bestFit"/>
-  <w:proofState w:spelling="clean" w:grammar="clean"/>
-  <w:defaultTabStop w:val="720"/>
-  <w:characterSpacingControl w:val="doNotCompress"/>
-  <w:savePreviewPicture/>
-  <w:compat>
-    <w:useFELayout/>
-    <w:compatSetting w:name="compatibilityMode" w:uri="http://schemas.microsoft.com/office/word" w:val="14"/>
-    <w:compatSetting w:name="overrideTableStyleFontSizeAndJustification" w:uri="http://schemas.microsoft.com/office/word" w:val="1"/>
-    <w:compatSetting w:name="enableOpenTypeFeatures" w:uri="http://schemas.microsoft.com/office/word" w:val="1"/>
-    <w:compatSetting w:name="doNotFlipMirrorIndents" w:uri="http://schemas.microsoft.com/office/word" w:val="1"/>
-  </w:compat>
-  <w:rsids>
-    <w:rsidRoot w:val="00B47730"/>
-    <w:rsid w:val="00034616"/>
-    <w:rsid w:val="0006063C"/>
-    <w:rsid w:val="0015074B"/>
-    <w:rsid w:val="0029639D"/>
-    <w:rsid w:val="00326F90"/>
-    <w:rsid w:val="00AA1D8D"/>
-    <w:rsid w:val="00B47730"/>
-    <w:rsid w:val="00CB0664"/>
-    <w:rsid w:val="00FC693F"/>
-  </w:rsids>
-  <m:mathPr>
-    <m:mathFont m:val="Cambria Math"/>
-    <m:brkBin m:val="before"/>
-    <m:brkBinSub m:val="--"/>
-    <m:smallFrac m:val="0"/>
-    <m:dispDef/>
-    <m:lMargin m:val="0"/>
-    <m:rMargin m:val="0"/>
-    <m:defJc m:val="centerGroup"/>
-    <m:wrapIndent m:val="1440"/>
-    <m:intLim m:val="subSup"/>
-    <m:naryLim m:val="undOvr"/>
-  </m:mathPr>
-  <w:themeFontLang w:val="en-US" w:eastAsia="ja-JP"/>
-  <w:clrSchemeMapping w:bg1="light1" w:t1="dark1" w:bg2="light2" w:t2="dark2" w:accent1="accent1" w:accent2="accent2" w:accent3="accent3" w:accent4="accent4" w:accent5="accent5" w:accent6="accent6" w:hyperlink="hyperlink" w:followedHyperlink="followedHyperlink"/>
-  <w:doNotAutoCompressPictures/>
-  <w:shapeDefaults>
-    <o:shapedefaults v:ext="edit" spidmax="1027"/>
-    <o:shapelayout v:ext="edit">
-      <o:idmap v:ext="edit" data="1"/>
-    </o:shapelayout>
-  </w:shapeDefaults>
-  <w:decimalSymbol w:val="."/>
-  <w:listSeparator w:val=","/>
-  <w14:docId w14:val="24062061"/>
-  <w14:defaultImageDpi w14:val="300"/>
-</w:settings>
-</file>
-
-<file path=word\styles.xml><?xml version="1.0" encoding="utf-8"?>
+<file path=word/styles.xml><?xml version="1.0" encoding="utf-8"?>
 <w:styles xmlns:mc="http://schemas.openxmlformats.org/markup-compatibility/2006" xmlns:r="http://schemas.openxmlformats.org/officeDocument/2006/relationships" xmlns:w="http://schemas.openxmlformats.org/wordprocessingml/2006/main" xmlns:w14="http://schemas.microsoft.com/office/word/2010/wordml" mc:Ignorable="w14">
   <w:docDefaults>
     <w:rPrDefault>
@@ -14398,7 +14307,7 @@
 </w:styles>
 </file>
 
-<file path=word\stylesWithEffects.xml><?xml version="1.0" encoding="utf-8"?>
+<file path=word/stylesWithEffects.xml><?xml version="1.0" encoding="utf-8"?>
 <w:styles xmlns:wpc="http://schemas.microsoft.com/office/word/2010/wordprocessingCanvas" xmlns:mo="http://schemas.microsoft.com/office/mac/office/2008/main" xmlns:mc="http://schemas.openxmlformats.org/markup-compatibility/2006" xmlns:mv="urn:schemas-microsoft-com:mac:vml" xmlns:o="urn:schemas-microsoft-com:office:office" xmlns:r="http://schemas.openxmlformats.org/officeDocument/2006/relationships" xmlns:m="http://schemas.openxmlformats.org/officeDocument/2006/math" xmlns:v="urn:schemas-microsoft-com:vml" xmlns:wp14="http://schemas.microsoft.com/office/word/2010/wordprocessingDrawing" xmlns:wp="http://schemas.openxmlformats.org/drawingml/2006/wordprocessingDrawing" xmlns:w10="urn:schemas-microsoft-com:office:word" xmlns:w="http://schemas.openxmlformats.org/wordprocessingml/2006/main" xmlns:w14="http://schemas.microsoft.com/office/word/2010/wordml" xmlns:wpg="http://schemas.microsoft.com/office/word/2010/wordprocessingGroup" xmlns:wpi="http://schemas.microsoft.com/office/word/2010/wordprocessingInk" xmlns:wne="http://schemas.microsoft.com/office/word/2006/wordml" xmlns:wps="http://schemas.microsoft.com/office/word/2010/wordprocessingShape" mc:Ignorable="w14 wp14">
   <w:docDefaults>
     <w:rPrDefault>
@@ -26200,7 +26109,7 @@
 </w:styles>
 </file>
 
-<file path=word\theme\theme1.xml><?xml version="1.0" encoding="utf-8"?>
+<file path=word/theme/theme1.xml><?xml version="1.0" encoding="utf-8"?>
 <a:theme xmlns:a="http://schemas.openxmlformats.org/drawingml/2006/main" name="Office Theme">
   <a:themeElements>
     <a:clrScheme name="Office">
@@ -26520,9 +26429,14 @@
 </a:theme>
 </file>
 
-<file path=word\webSettings.xml><?xml version="1.0" encoding="utf-8"?>
-<w:webSettings xmlns:mc="http://schemas.openxmlformats.org/markup-compatibility/2006" xmlns:r="http://schemas.openxmlformats.org/officeDocument/2006/relationships" xmlns:w="http://schemas.openxmlformats.org/wordprocessingml/2006/main" xmlns:w14="http://schemas.microsoft.com/office/word/2010/wordml" mc:Ignorable="w14">
-  <w:allowPNG/>
-  <w:doNotSaveAsSingleFile/>
-</w:webSettings>
+<file path=customXml/item1.xml><?xml version="1.0" encoding="utf-8"?>
+<b:Sources xmlns:b="http://schemas.openxmlformats.org/officeDocument/2006/bibliography" xmlns="http://schemas.openxmlformats.org/officeDocument/2006/bibliography" SelectedStyle="/APA.XSL" StyleName="APA"/>
+</file>
+
+<file path=customXml/itemProps1.xml><?xml version="1.0" encoding="utf-8"?>
+<ds:datastoreItem xmlns:ds="http://schemas.openxmlformats.org/officeDocument/2006/customXml" ds:itemID="{EF278816-EC6F-A645-907D-7F25AECB1D4A}">
+  <ds:schemaRefs>
+    <ds:schemaRef ds:uri="http://schemas.openxmlformats.org/officeDocument/2006/bibliography"/>
+  </ds:schemaRefs>
+</ds:datastoreItem>
 </file>
</xml_diff>

<commit_message>
feat(ui): novy vzhled ve stylu administracnich rozhrani (Polaris/Stripe), odstraneni emoji, ceske formatovani cisel; aktualizace README a docx
</commit_message>
<xml_diff>
--- a/PPRO_Dokumentace.docx
+++ b/PPRO_Dokumentace.docx
@@ -1503,6 +1503,99 @@
           </w:p>
         </w:tc>
       </w:tr>
+      <w:tr>
+        <w:trPr>
+          <w:trHeight w:val="510"/>
+        </w:trPr>
+        <w:tc>
+          <w:tcPr>
+            <w:tcW w:type="dxa" w:w="737"/>
+            <w:tcMar>
+              <w:top w:w="70" w:type="dxa"/>
+              <w:left w:w="100" w:type="dxa"/>
+              <w:bottom w:w="70" w:type="dxa"/>
+              <w:right w:w="100" w:type="dxa"/>
+            </w:tcMar>
+          </w:tcPr>
+          <w:p>
+            <w:pPr>
+              <w:spacing after="0"/>
+            </w:pPr>
+            <w:r>
+              <w:rPr>
+                <w:sz val="20"/>
+              </w:rPr>
+              <w:t>R12</w:t>
+            </w:r>
+          </w:p>
+        </w:tc>
+        <w:tc>
+          <w:tcPr>
+            <w:tcW w:type="dxa" w:w="3628"/>
+            <w:tcMar>
+              <w:top w:w="70" w:type="dxa"/>
+              <w:left w:w="100" w:type="dxa"/>
+              <w:bottom w:w="70" w:type="dxa"/>
+              <w:right w:w="100" w:type="dxa"/>
+            </w:tcMar>
+          </w:tcPr>
+          <w:p>
+            <w:pPr>
+              <w:spacing after="0"/>
+            </w:pPr>
+            <w:r>
+              <w:rPr>
+                <w:sz val="20"/>
+              </w:rPr>
+              <w:t>Vzhled webového rozhraní podle administračních systémů (Shopify Admin / Polaris, Stripe Dashboard): boční navigace, neutrální paleta, systémové písmo, kompaktní tabulky, bez emoji.</w:t>
+            </w:r>
+          </w:p>
+        </w:tc>
+        <w:tc>
+          <w:tcPr>
+            <w:tcW w:type="dxa" w:w="3855"/>
+            <w:tcMar>
+              <w:top w:w="70" w:type="dxa"/>
+              <w:left w:w="100" w:type="dxa"/>
+              <w:bottom w:w="70" w:type="dxa"/>
+              <w:right w:w="100" w:type="dxa"/>
+            </w:tcMar>
+          </w:tcPr>
+          <w:p>
+            <w:pPr>
+              <w:spacing after="0"/>
+            </w:pPr>
+            <w:r>
+              <w:rPr>
+                <w:sz val="20"/>
+              </w:rPr>
+              <w:t>Skladový systém je pracovní nástroj – důraz na čitelnost tabulek a čísel, ověřené vzory známé z běžných e-shopových administrací, na telefonu se navigace mění na horní lištu.</w:t>
+            </w:r>
+          </w:p>
+        </w:tc>
+        <w:tc>
+          <w:tcPr>
+            <w:tcW w:type="dxa" w:w="1417"/>
+            <w:tcMar>
+              <w:top w:w="70" w:type="dxa"/>
+              <w:left w:w="100" w:type="dxa"/>
+              <w:bottom w:w="70" w:type="dxa"/>
+              <w:right w:w="100" w:type="dxa"/>
+            </w:tcMar>
+          </w:tcPr>
+          <w:p>
+            <w:pPr>
+              <w:spacing after="0"/>
+            </w:pPr>
+            <w:r>
+              <w:rPr>
+                <w:sz val="20"/>
+              </w:rPr>
+              <w:t>21. 10. 2026</w:t>
+            </w:r>
+          </w:p>
+        </w:tc>
+      </w:tr>
     </w:tbl>
     <w:p>
       <w:pPr>

</xml_diff>

<commit_message>
docs(docx): zapis pozadavku klienta Z6 na redesign a odstraneni emoji do Wordu i README
</commit_message>
<xml_diff>
--- a/PPRO_Dokumentace.docx
+++ b/PPRO_Dokumentace.docx
@@ -2332,6 +2332,121 @@
           </w:p>
         </w:tc>
       </w:tr>
+      <w:tr>
+        <w:trPr>
+          <w:trHeight w:val="624"/>
+        </w:trPr>
+        <w:tc>
+          <w:tcPr>
+            <w:tcW w:type="dxa" w:w="737"/>
+            <w:tcMar>
+              <w:top w:w="70" w:type="dxa"/>
+              <w:left w:w="100" w:type="dxa"/>
+              <w:bottom w:w="70" w:type="dxa"/>
+              <w:right w:w="100" w:type="dxa"/>
+            </w:tcMar>
+          </w:tcPr>
+          <w:p>
+            <w:pPr>
+              <w:spacing after="0"/>
+            </w:pPr>
+            <w:r>
+              <w:rPr>
+                <w:sz val="20"/>
+              </w:rPr>
+              <w:t>Z6</w:t>
+            </w:r>
+          </w:p>
+        </w:tc>
+        <w:tc>
+          <w:tcPr>
+            <w:tcW w:type="dxa" w:w="1417"/>
+            <w:tcMar>
+              <w:top w:w="70" w:type="dxa"/>
+              <w:left w:w="100" w:type="dxa"/>
+              <w:bottom w:w="70" w:type="dxa"/>
+              <w:right w:w="100" w:type="dxa"/>
+            </w:tcMar>
+          </w:tcPr>
+          <w:p>
+            <w:pPr>
+              <w:spacing after="0"/>
+            </w:pPr>
+            <w:r>
+              <w:rPr>
+                <w:sz val="20"/>
+              </w:rPr>
+              <w:t>21. 10. 2026</w:t>
+            </w:r>
+          </w:p>
+        </w:tc>
+        <w:tc>
+          <w:tcPr>
+            <w:tcW w:type="dxa" w:w="2948"/>
+            <w:tcMar>
+              <w:top w:w="70" w:type="dxa"/>
+              <w:left w:w="100" w:type="dxa"/>
+              <w:bottom w:w="70" w:type="dxa"/>
+              <w:right w:w="100" w:type="dxa"/>
+            </w:tcMar>
+          </w:tcPr>
+          <w:p>
+            <w:pPr>
+              <w:spacing after="0"/>
+            </w:pPr>
+            <w:r>
+              <w:rPr>
+                <w:sz val="20"/>
+              </w:rPr>
+              <w:t>„Změnit vzhled systému, smazat všechny emotikony a typický AI vzhled; vzít inspiraci z reálných profesionálních aplikací.“</w:t>
+            </w:r>
+          </w:p>
+        </w:tc>
+        <w:tc>
+          <w:tcPr>
+            <w:tcW w:type="dxa" w:w="3288"/>
+            <w:tcMar>
+              <w:top w:w="70" w:type="dxa"/>
+              <w:left w:w="100" w:type="dxa"/>
+              <w:bottom w:w="70" w:type="dxa"/>
+              <w:right w:w="100" w:type="dxa"/>
+            </w:tcMar>
+          </w:tcPr>
+          <w:p>
+            <w:pPr>
+              <w:spacing after="0"/>
+            </w:pPr>
+            <w:r>
+              <w:rPr>
+                <w:sz val="20"/>
+              </w:rPr>
+              <w:t>Kompletní redesign prezentační vrstvy dle vzoru Shopify Admin (Polaris) a Stripe: boční panel, systémová typografie, neutrální paleta, kompaktní tabulky a SVG ikony namísto emoji. Viz R12.</w:t>
+            </w:r>
+          </w:p>
+        </w:tc>
+        <w:tc>
+          <w:tcPr>
+            <w:tcW w:type="dxa" w:w="1247"/>
+            <w:tcMar>
+              <w:top w:w="70" w:type="dxa"/>
+              <w:left w:w="100" w:type="dxa"/>
+              <w:bottom w:w="70" w:type="dxa"/>
+              <w:right w:w="100" w:type="dxa"/>
+            </w:tcMar>
+          </w:tcPr>
+          <w:p>
+            <w:pPr>
+              <w:spacing after="0"/>
+            </w:pPr>
+            <w:r>
+              <w:rPr>
+                <w:sz val="20"/>
+              </w:rPr>
+              <w:t>hotovo</w:t>
+            </w:r>
+          </w:p>
+        </w:tc>
+      </w:tr>
     </w:tbl>
     <w:sectPr>
       <w:pgSz w:w="11906" w:h="16838"/>

</xml_diff>